<commit_message>
Update submission brief with Firebase frontend link
</commit_message>
<xml_diff>
--- a/docs/Community_Hero_Project_Submission_Brief.docx
+++ b/docs/Community_Hero_Project_Submission_Brief.docx
@@ -49,7 +49,7 @@
     <w:p/>
     <w:p>
       <w:r>
-        <w:t xml:space="preserve">Current live demo deployment: </w:t>
+        <w:t xml:space="preserve">Live application: </w:t>
       </w:r>
       <w:hyperlink r:id="rId2" w:history="1">
         <w:r>
@@ -57,39 +57,50 @@
             <w:color w:val="0563C1"/>
             <w:u w:val="single"/>
           </w:rPr>
-          <w:t>https://community-hero-frontend-i725.onrender.com</w:t>
+          <w:t>https://chero-r115-20260630.web.app</w:t>
         </w:r>
       </w:hyperlink>
     </w:p>
     <w:p/>
     <w:p>
+      <w:r>
+        <w:t xml:space="preserve">Alternate Firebase Hosting URL: </w:t>
+      </w:r>
+      <w:hyperlink r:id="rId3" w:history="1">
+        <w:r>
+          <w:rPr>
+            <w:color w:val="0563C1"/>
+            <w:u w:val="single"/>
+          </w:rPr>
+          <w:t>https://chero-r115-20260630.firebaseapp.com</w:t>
+        </w:r>
+      </w:hyperlink>
+    </w:p>
+    <w:p/>
+    <w:p>
       <w:pPr>
         <w:pStyle w:val="Heading1"/>
       </w:pPr>
       <w:r>
-        <w:t>Google Cloud Deployment Note</w:t>
-      </w:r>
-    </w:p>
-    <w:p/>
-    <w:p>
-      <w:r>
-        <w:t>The hackathon guideline asks for a Google Cloud hosted deployment. I attempted to complete the Google Cloud deployment, but Google Cloud billing activation is currently blocked on my side. Autopay is already set up on my phone, I tried different Google accounts, and I also tried adding a card manually; however, the billing setup is still not reflecting correctly in Google Cloud Console.</w:t>
-      </w:r>
-    </w:p>
-    <w:p/>
-    <w:p>
-      <w:r>
-        <w:t xml:space="preserve">I have already mailed the organizers about this issue from </w:t>
-      </w:r>
-      <w:r>
-        <w:rPr>
-          <w:rFonts w:ascii="Courier New" w:hAnsi="Courier New"/>
-          <w:shd w:fill="F3F4F6"/>
-        </w:rPr>
-        <w:t>ritvikraj.ipl@gmail.com</w:t>
-      </w:r>
-      <w:r>
-        <w:t>. Until the Google Cloud billing issue is resolved, I request the evaluators to please consider the Render deployment as the live functional demo and judge the project unbiasedly based on the working product, source code, architecture, and Google technology integrations. The application is already structured to be deployed on Google Cloud once billing access becomes available.</w:t>
+        <w:t>Solution Overview</w:t>
+      </w:r>
+    </w:p>
+    <w:p/>
+    <w:p>
+      <w:r>
+        <w:t>Community Hero is an AI-powered, geofenced civic issue management platform for residential societies, gated communities, campuses, and smart neighborhoods. It helps a community report, verify, track, resolve, and learn from hyperlocal problems such as water leaks, potholes, damaged lights, waste issues, broken infrastructure, and other neighborhood-level concerns.</w:t>
+      </w:r>
+    </w:p>
+    <w:p/>
+    <w:p>
+      <w:r>
+        <w:t>The product is built around the complete lifecycle of a community issue. An admin creates a community boundary using Google Maps, either by selecting a radius around the current location or by manually marking a polygon boundary. Residents can join only when their current GPS location is inside that community boundary. Once approved, residents can report issues with an image, description, and location. Google Gemini analyzes the report, detects spam or invalid uploads when confidence is high, classifies the issue, estimates severity, and supports the duplicate and history system.</w:t>
+      </w:r>
+    </w:p>
+    <w:p/>
+    <w:p>
+      <w:r>
+        <w:t>The platform keeps the workflow fair. Issue creators cannot approve their own reports, and solvers cannot verify their own fixes. More than one resident can collaborate on the same issue, admins can upload direct fixes, and every resolution requires useful proof and a description so the community builds future knowledge instead of only closing tickets.</w:t>
       </w:r>
     </w:p>
     <w:p/>
@@ -98,25 +109,162 @@
         <w:pStyle w:val="Heading1"/>
       </w:pPr>
       <w:r>
-        <w:t>Solution Overview</w:t>
-      </w:r>
-    </w:p>
-    <w:p/>
-    <w:p>
-      <w:r>
-        <w:t>Community Hero is an AI-powered, geofenced civic issue management platform for residential societies, gated communities, campuses, and smart neighborhoods. It helps a community report, verify, track, resolve, and learn from hyperlocal problems such as water leaks, potholes, damaged lights, waste issues, broken infrastructure, and other neighborhood-level concerns.</w:t>
-      </w:r>
-    </w:p>
-    <w:p/>
-    <w:p>
-      <w:r>
-        <w:t>The product is built around the complete lifecycle of a community issue. An admin creates a community boundary using Google Maps, either by selecting a radius around the current location or by manually marking a polygon boundary. Residents can join only when their current GPS location is inside that community boundary. Once approved, residents can report issues with an image, description, and location. Google Gemini analyzes the report, detects spam or invalid uploads when confidence is high, classifies the issue, estimates severity, and supports the duplicate and history system.</w:t>
-      </w:r>
-    </w:p>
-    <w:p/>
-    <w:p>
-      <w:r>
-        <w:t>The platform keeps the workflow fair. Issue creators cannot approve their own reports, and solvers cannot verify their own fixes. More than one resident can collaborate on the same issue, admins can upload direct fixes, and every resolution requires useful proof and a description so the community builds future knowledge instead of only closing tickets.</w:t>
+        <w:t>Current Deployment Setup</w:t>
+      </w:r>
+    </w:p>
+    <w:p/>
+    <w:p>
+      <w:r>
+        <w:t>The live evaluator-facing application is deployed on Firebase Hosting:</w:t>
+      </w:r>
+    </w:p>
+    <w:p/>
+    <w:p>
+      <w:pPr>
+        <w:numPr>
+          <w:ilvl w:val="0"/>
+          <w:numId w:val="1"/>
+        </w:numPr>
+      </w:pPr>
+      <w:r>
+        <w:t xml:space="preserve">Primary URL: </w:t>
+      </w:r>
+      <w:hyperlink r:id="rId4" w:history="1">
+        <w:r>
+          <w:rPr>
+            <w:color w:val="0563C1"/>
+            <w:u w:val="single"/>
+          </w:rPr>
+          <w:t>https://chero-r115-20260630.web.app</w:t>
+        </w:r>
+      </w:hyperlink>
+    </w:p>
+    <w:p>
+      <w:pPr>
+        <w:numPr>
+          <w:ilvl w:val="0"/>
+          <w:numId w:val="1"/>
+        </w:numPr>
+      </w:pPr>
+      <w:r>
+        <w:t xml:space="preserve">Alternate URL: </w:t>
+      </w:r>
+      <w:hyperlink r:id="rId5" w:history="1">
+        <w:r>
+          <w:rPr>
+            <w:color w:val="0563C1"/>
+            <w:u w:val="single"/>
+          </w:rPr>
+          <w:t>https://chero-r115-20260630.firebaseapp.com</w:t>
+        </w:r>
+      </w:hyperlink>
+    </w:p>
+    <w:p>
+      <w:pPr>
+        <w:numPr>
+          <w:ilvl w:val="0"/>
+          <w:numId w:val="1"/>
+        </w:numPr>
+      </w:pPr>
+      <w:r>
+        <w:t xml:space="preserve">Firebase project ID: </w:t>
+      </w:r>
+      <w:r>
+        <w:rPr>
+          <w:rFonts w:ascii="Courier New" w:hAnsi="Courier New"/>
+          <w:shd w:fill="F3F4F6"/>
+        </w:rPr>
+        <w:t>chero-r115-20260630</w:t>
+      </w:r>
+    </w:p>
+    <w:p>
+      <w:pPr>
+        <w:numPr>
+          <w:ilvl w:val="0"/>
+          <w:numId w:val="1"/>
+        </w:numPr>
+      </w:pPr>
+      <w:r>
+        <w:t xml:space="preserve">Hosting site: </w:t>
+      </w:r>
+      <w:r>
+        <w:rPr>
+          <w:rFonts w:ascii="Courier New" w:hAnsi="Courier New"/>
+          <w:shd w:fill="F3F4F6"/>
+        </w:rPr>
+        <w:t>chero-r115-20260630</w:t>
+      </w:r>
+    </w:p>
+    <w:p/>
+    <w:p>
+      <w:r>
+        <w:t xml:space="preserve">The React production build is deployed as a static single page application. Firebase Hosting rewrites all app routes to </w:t>
+      </w:r>
+      <w:r>
+        <w:rPr>
+          <w:rFonts w:ascii="Courier New" w:hAnsi="Courier New"/>
+          <w:shd w:fill="F3F4F6"/>
+        </w:rPr>
+        <w:t>index.html</w:t>
+      </w:r>
+      <w:r>
+        <w:t xml:space="preserve">, so direct links, refresh, browser back, and routes such as </w:t>
+      </w:r>
+      <w:r>
+        <w:rPr>
+          <w:rFonts w:ascii="Courier New" w:hAnsi="Courier New"/>
+          <w:shd w:fill="F3F4F6"/>
+        </w:rPr>
+        <w:t>/login</w:t>
+      </w:r>
+      <w:r>
+        <w:t xml:space="preserve">, </w:t>
+      </w:r>
+      <w:r>
+        <w:rPr>
+          <w:rFonts w:ascii="Courier New" w:hAnsi="Courier New"/>
+          <w:shd w:fill="F3F4F6"/>
+        </w:rPr>
+        <w:t>/dashboard</w:t>
+      </w:r>
+      <w:r>
+        <w:t xml:space="preserve">, </w:t>
+      </w:r>
+      <w:r>
+        <w:rPr>
+          <w:rFonts w:ascii="Courier New" w:hAnsi="Courier New"/>
+          <w:shd w:fill="F3F4F6"/>
+        </w:rPr>
+        <w:t>/issues</w:t>
+      </w:r>
+      <w:r>
+        <w:t xml:space="preserve">, and </w:t>
+      </w:r>
+      <w:r>
+        <w:rPr>
+          <w:rFonts w:ascii="Courier New" w:hAnsi="Courier New"/>
+          <w:shd w:fill="F3F4F6"/>
+        </w:rPr>
+        <w:t>/create-issue</w:t>
+      </w:r>
+      <w:r>
+        <w:t xml:space="preserve"> work correctly.</w:t>
+      </w:r>
+    </w:p>
+    <w:p/>
+    <w:p>
+      <w:r>
+        <w:t xml:space="preserve">The GitHub repository is connected to Firebase Hosting through GitHub Actions. On every push to </w:t>
+      </w:r>
+      <w:r>
+        <w:rPr>
+          <w:rFonts w:ascii="Courier New" w:hAnsi="Courier New"/>
+          <w:shd w:fill="F3F4F6"/>
+        </w:rPr>
+        <w:t>main</w:t>
+      </w:r>
+      <w:r>
+        <w:t>, the workflow builds the frontend and deploys the latest production bundle to Firebase Hosting. Required deployment secrets and variables are configured in the repository.</w:t>
       </w:r>
     </w:p>
     <w:p/>
@@ -140,7 +288,7 @@
     <w:p/>
     <w:p>
       <w:r>
-        <w:t>An admin registers, logs in, opens community setup, and locks the current location. The admin can then choose Radius mode or Polygon mode. Radius mode stores a center point and a radius in meters. Polygon mode stores a manually marked GeoJSON boundary on Google Maps. The backend saves this geofence and attaches the admin to the newly created society.</w:t>
+        <w:t>An admin registers, logs in, opens community setup, and locks the current location. The admin can then choose Radius mode or Polygon mode. Radius mode stores a center point and a radius in meters. Polygon mode stores a manually marked GeoJSON boundary on Google Maps. The system saves this geofence and attaches the admin to the newly created society.</w:t>
       </w:r>
     </w:p>
     <w:p/>
@@ -155,7 +303,7 @@
     <w:p/>
     <w:p>
       <w:r>
-        <w:t>A resident registers without being attached to any community. The resident enters the Society ID shared by the admin and verifies current GPS location. The backend checks that GPS point against the selected society boundary. If the resident is physically inside the community, the join request becomes pending. The admin can then review and approve the resident.</w:t>
+        <w:t>A resident registers without being attached to any community. The resident enters the Society ID shared by the admin and verifies current GPS location. The system checks that GPS point against the selected society boundary. If the resident is physically inside the community, the join request becomes pending. The admin can then review and approve the resident.</w:t>
       </w:r>
     </w:p>
     <w:p/>
@@ -170,7 +318,7 @@
     <w:p/>
     <w:p>
       <w:r>
-        <w:t>Approved residents are checked against their assigned community during login. The backend first identifies the resident from email and password, then verifies the submitted GPS location against that resident's society boundary. Resident login succeeds only when the location is inside the community geofence.</w:t>
+        <w:t>Approved residents are checked against their assigned community during login. The system first identifies the resident from email and password, then verifies the submitted GPS location against that resident's society boundary. Resident login succeeds only when the location is inside the community geofence.</w:t>
       </w:r>
     </w:p>
     <w:p/>
@@ -191,7 +339,7 @@
     <w:p/>
     <w:p>
       <w:r>
-        <w:t>An approved resident creates an issue by uploading an image, adding a title and description, and locking GPS. The backend verifies that the issue location is inside the resident's society boundary. Gemini then evaluates the report. If Gemini is highly confident that the image is spam, unrelated, or does not show a real civic issue, the report is rejected before community voting. If Gemini is uncertain, the system avoids making a hard decision and allows the community verification flow to continue.</w:t>
+        <w:t>An approved resident creates an issue by uploading an image, adding a title and description, and locking GPS. The system verifies that the issue location is inside the resident's society boundary. Gemini then evaluates the report. If Gemini is highly confident that the image is spam, unrelated, or does not show a real civic issue, the report is rejected before community voting. If Gemini is uncertain, the system avoids making a hard decision and allows the community verification flow to continue.</w:t>
       </w:r>
     </w:p>
     <w:p/>
@@ -298,7 +446,7 @@
         </w:numPr>
       </w:pPr>
       <w:r>
-        <w:t>Issue creation with backend geofence enforcement.</w:t>
+        <w:t>Issue creation with geofence enforcement.</w:t>
       </w:r>
     </w:p>
     <w:p>
@@ -452,7 +600,7 @@
         </w:numPr>
       </w:pPr>
       <w:r>
-        <w:t>Production-ready environment configuration for frontend and backend deployment.</w:t>
+        <w:t>Production-ready Firebase Hosting deployment with GitHub Actions automation.</w:t>
       </w:r>
     </w:p>
     <w:p/>
@@ -467,7 +615,7 @@
     <w:p/>
     <w:p>
       <w:r>
-        <w:t>Community Hero uses a React single page frontend and a Node.js Express backend.</w:t>
+        <w:t>Community Hero uses a React single page frontend with an API-backed workflow and MongoDB persistence.</w:t>
       </w:r>
     </w:p>
     <w:p/>
@@ -545,19 +693,19 @@
     <w:p/>
     <w:p>
       <w:r>
-        <w:t>Backend:</w:t>
-      </w:r>
-    </w:p>
-    <w:p/>
-    <w:p>
-      <w:pPr>
-        <w:numPr>
-          <w:ilvl w:val="0"/>
-          <w:numId w:val="1"/>
-        </w:numPr>
-      </w:pPr>
-      <w:r>
-        <w:t>Node.js and Express REST API.</w:t>
+        <w:t>API and data layer:</w:t>
+      </w:r>
+    </w:p>
+    <w:p/>
+    <w:p>
+      <w:pPr>
+        <w:numPr>
+          <w:ilvl w:val="0"/>
+          <w:numId w:val="1"/>
+        </w:numPr>
+      </w:pPr>
+      <w:r>
+        <w:t>Express REST API for authentication, societies, issues, voting, maintenance, notifications, reports, and analytics.</w:t>
       </w:r>
     </w:p>
     <w:p>
@@ -590,7 +738,7 @@
         </w:numPr>
       </w:pPr>
       <w:r>
-        <w:t>Backend geofence middleware for society-bound workflows.</w:t>
+        <w:t>Geofence middleware for society-bound workflows.</w:t>
       </w:r>
     </w:p>
     <w:p>
@@ -1019,41 +1167,62 @@
     <w:p/>
     <w:p>
       <w:r>
-        <w:t>Google Cloud:</w:t>
-      </w:r>
-    </w:p>
-    <w:p/>
-    <w:p>
-      <w:pPr>
-        <w:numPr>
-          <w:ilvl w:val="0"/>
-          <w:numId w:val="1"/>
-        </w:numPr>
-      </w:pPr>
-      <w:r>
-        <w:t>The codebase is deployment-ready for Google Cloud once billing access is available.</w:t>
-      </w:r>
-    </w:p>
-    <w:p>
-      <w:pPr>
-        <w:numPr>
-          <w:ilvl w:val="0"/>
-          <w:numId w:val="1"/>
-        </w:numPr>
-      </w:pPr>
-      <w:r>
-        <w:t>Recommended Google Cloud deployment shape is a static frontend deployment plus backend API on Cloud Run.</w:t>
-      </w:r>
-    </w:p>
-    <w:p>
-      <w:pPr>
-        <w:numPr>
-          <w:ilvl w:val="0"/>
-          <w:numId w:val="1"/>
-        </w:numPr>
-      </w:pPr>
-      <w:r>
-        <w:t>Environment variables are already separated for frontend URL, backend URL, CORS origins, JWT secret, MongoDB URI, Google API keys, Gemini model names, embedding dimensions, and threshold tuning.</w:t>
+        <w:t>Firebase Hosting:</w:t>
+      </w:r>
+    </w:p>
+    <w:p/>
+    <w:p>
+      <w:pPr>
+        <w:numPr>
+          <w:ilvl w:val="0"/>
+          <w:numId w:val="1"/>
+        </w:numPr>
+      </w:pPr>
+      <w:r>
+        <w:t>Hosts the live React frontend.</w:t>
+      </w:r>
+    </w:p>
+    <w:p>
+      <w:pPr>
+        <w:numPr>
+          <w:ilvl w:val="0"/>
+          <w:numId w:val="1"/>
+        </w:numPr>
+      </w:pPr>
+      <w:r>
+        <w:t>Serves the production static build.</w:t>
+      </w:r>
+    </w:p>
+    <w:p>
+      <w:pPr>
+        <w:numPr>
+          <w:ilvl w:val="0"/>
+          <w:numId w:val="1"/>
+        </w:numPr>
+      </w:pPr>
+      <w:r>
+        <w:t xml:space="preserve">Rewrites all frontend routes to </w:t>
+      </w:r>
+      <w:r>
+        <w:rPr>
+          <w:rFonts w:ascii="Courier New" w:hAnsi="Courier New"/>
+          <w:shd w:fill="F3F4F6"/>
+        </w:rPr>
+        <w:t>index.html</w:t>
+      </w:r>
+      <w:r>
+        <w:t xml:space="preserve"> for smooth SPA navigation.</w:t>
+      </w:r>
+    </w:p>
+    <w:p>
+      <w:pPr>
+        <w:numPr>
+          <w:ilvl w:val="0"/>
+          <w:numId w:val="1"/>
+        </w:numPr>
+      </w:pPr>
+      <w:r>
+        <w:t>Integrates with GitHub Actions for continuous deployment.</w:t>
       </w:r>
     </w:p>
     <w:p/>
@@ -1142,10 +1311,32 @@
         <w:t>@react-google-maps/api</w:t>
       </w:r>
     </w:p>
-    <w:p/>
-    <w:p>
-      <w:r>
-        <w:t>Backend:</w:t>
+    <w:p>
+      <w:pPr>
+        <w:numPr>
+          <w:ilvl w:val="0"/>
+          <w:numId w:val="1"/>
+        </w:numPr>
+      </w:pPr>
+      <w:r>
+        <w:t>Firebase Hosting</w:t>
+      </w:r>
+    </w:p>
+    <w:p>
+      <w:pPr>
+        <w:numPr>
+          <w:ilvl w:val="0"/>
+          <w:numId w:val="1"/>
+        </w:numPr>
+      </w:pPr>
+      <w:r>
+        <w:t>GitHub Actions</w:t>
+      </w:r>
+    </w:p>
+    <w:p/>
+    <w:p>
+      <w:r>
+        <w:t>API, AI, and data:</w:t>
       </w:r>
     </w:p>
     <w:p/>
@@ -1234,35 +1425,6 @@
         </w:numPr>
       </w:pPr>
       <w:r>
-        <w:t>CORS</w:t>
-      </w:r>
-    </w:p>
-    <w:p>
-      <w:pPr>
-        <w:numPr>
-          <w:ilvl w:val="0"/>
-          <w:numId w:val="1"/>
-        </w:numPr>
-      </w:pPr>
-      <w:r>
-        <w:t>Node cron jobs</w:t>
-      </w:r>
-    </w:p>
-    <w:p/>
-    <w:p>
-      <w:r>
-        <w:t>AI and data:</w:t>
-      </w:r>
-    </w:p>
-    <w:p/>
-    <w:p>
-      <w:pPr>
-        <w:numPr>
-          <w:ilvl w:val="0"/>
-          <w:numId w:val="1"/>
-        </w:numPr>
-      </w:pPr>
-      <w:r>
         <w:t xml:space="preserve">Google Gemini API through </w:t>
       </w:r>
       <w:r>
@@ -1330,79 +1492,6 @@
     </w:p>
     <w:p/>
     <w:p>
-      <w:r>
-        <w:t>Deployment and operations:</w:t>
-      </w:r>
-    </w:p>
-    <w:p/>
-    <w:p>
-      <w:pPr>
-        <w:numPr>
-          <w:ilvl w:val="0"/>
-          <w:numId w:val="1"/>
-        </w:numPr>
-      </w:pPr>
-      <w:r>
-        <w:t>Environment-based configuration.</w:t>
-      </w:r>
-    </w:p>
-    <w:p>
-      <w:pPr>
-        <w:numPr>
-          <w:ilvl w:val="0"/>
-          <w:numId w:val="1"/>
-        </w:numPr>
-      </w:pPr>
-      <w:r>
-        <w:t>Static frontend build.</w:t>
-      </w:r>
-    </w:p>
-    <w:p>
-      <w:pPr>
-        <w:numPr>
-          <w:ilvl w:val="0"/>
-          <w:numId w:val="1"/>
-        </w:numPr>
-      </w:pPr>
-      <w:r>
-        <w:t>Express API service.</w:t>
-      </w:r>
-    </w:p>
-    <w:p>
-      <w:pPr>
-        <w:numPr>
-          <w:ilvl w:val="0"/>
-          <w:numId w:val="1"/>
-        </w:numPr>
-      </w:pPr>
-      <w:r>
-        <w:t>Health check endpoint.</w:t>
-      </w:r>
-    </w:p>
-    <w:p>
-      <w:pPr>
-        <w:numPr>
-          <w:ilvl w:val="0"/>
-          <w:numId w:val="1"/>
-        </w:numPr>
-      </w:pPr>
-      <w:r>
-        <w:t>Optional keep-alive flow for free-tier backend hosting.</w:t>
-      </w:r>
-    </w:p>
-    <w:p>
-      <w:pPr>
-        <w:numPr>
-          <w:ilvl w:val="0"/>
-          <w:numId w:val="1"/>
-        </w:numPr>
-      </w:pPr>
-      <w:r>
-        <w:t>Render deployment currently used as the public live demo because Google Cloud billing activation is blocked.</w:t>
-      </w:r>
-    </w:p>
-    <w:p/>
-    <w:p>
       <w:pPr>
         <w:pStyle w:val="Heading1"/>
       </w:pPr>
@@ -1455,7 +1544,7 @@
     <w:p/>
     <w:p>
       <w:r>
-        <w:t>Gemini, Google embeddings, and Google Maps are core to the product experience. They are used for image understanding, semantic retrieval, duplicate intelligence, geofencing UI, and community visualization.</w:t>
+        <w:t>Gemini, Google embeddings, Google Maps, and Firebase Hosting are core to the product experience. They are used for image understanding, semantic retrieval, duplicate intelligence, geofencing UI, community visualization, and live deployment.</w:t>
       </w:r>
     </w:p>
     <w:p/>
@@ -1479,7 +1568,7 @@
     <w:p/>
     <w:p>
       <w:r>
-        <w:t>The backend enforces identity, role, society membership, geofence checks, upload validation, AI gates, duplicate logic, and workflow transitions. The frontend is configured for production static hosting and environment-based API URLs.</w:t>
+        <w:t>The system enforces identity, role, society membership, geofence checks, upload validation, AI gates, duplicate logic, and workflow transitions. The frontend is deployed on Firebase Hosting with production static routing and GitHub Actions automation.</w:t>
       </w:r>
     </w:p>
     <w:p/>
@@ -1512,8 +1601,17 @@
         </w:numPr>
       </w:pPr>
       <w:r>
-        <w:t>Open the deployed frontend.</w:t>
-      </w:r>
+        <w:t xml:space="preserve">Open the deployed frontend: </w:t>
+      </w:r>
+      <w:hyperlink r:id="rId6" w:history="1">
+        <w:r>
+          <w:rPr>
+            <w:color w:val="0563C1"/>
+            <w:u w:val="single"/>
+          </w:rPr>
+          <w:t>https://chero-r115-20260630.web.app</w:t>
+        </w:r>
+      </w:hyperlink>
     </w:p>
     <w:p>
       <w:pPr>
@@ -1948,191 +2046,34 @@
         <w:t>community-hero-frontend/src/utils/googleMaps.js</w:t>
       </w:r>
     </w:p>
-    <w:p/>
-    <w:p>
-      <w:r>
-        <w:t>Representative backend files:</w:t>
-      </w:r>
-    </w:p>
-    <w:p/>
-    <w:p>
-      <w:pPr>
-        <w:numPr>
-          <w:ilvl w:val="0"/>
-          <w:numId w:val="1"/>
-        </w:numPr>
-      </w:pPr>
-      <w:r>
-        <w:rPr>
-          <w:rFonts w:ascii="Courier New" w:hAnsi="Courier New"/>
-          <w:shd w:fill="F3F4F6"/>
-        </w:rPr>
-        <w:t>community-hero-backend/server.js</w:t>
-      </w:r>
-    </w:p>
-    <w:p>
-      <w:pPr>
-        <w:numPr>
-          <w:ilvl w:val="0"/>
-          <w:numId w:val="1"/>
-        </w:numPr>
-      </w:pPr>
-      <w:r>
-        <w:rPr>
-          <w:rFonts w:ascii="Courier New" w:hAnsi="Courier New"/>
-          <w:shd w:fill="F3F4F6"/>
-        </w:rPr>
-        <w:t>community-hero-backend/routes/apiRoutes.js</w:t>
-      </w:r>
-    </w:p>
-    <w:p>
-      <w:pPr>
-        <w:numPr>
-          <w:ilvl w:val="0"/>
-          <w:numId w:val="1"/>
-        </w:numPr>
-      </w:pPr>
-      <w:r>
-        <w:rPr>
-          <w:rFonts w:ascii="Courier New" w:hAnsi="Courier New"/>
-          <w:shd w:fill="F3F4F6"/>
-        </w:rPr>
-        <w:t>community-hero-backend/controllers/authController.js</w:t>
-      </w:r>
-    </w:p>
-    <w:p>
-      <w:pPr>
-        <w:numPr>
-          <w:ilvl w:val="0"/>
-          <w:numId w:val="1"/>
-        </w:numPr>
-      </w:pPr>
-      <w:r>
-        <w:rPr>
-          <w:rFonts w:ascii="Courier New" w:hAnsi="Courier New"/>
-          <w:shd w:fill="F3F4F6"/>
-        </w:rPr>
-        <w:t>community-hero-backend/controllers/societyController.js</w:t>
-      </w:r>
-    </w:p>
-    <w:p>
-      <w:pPr>
-        <w:numPr>
-          <w:ilvl w:val="0"/>
-          <w:numId w:val="1"/>
-        </w:numPr>
-      </w:pPr>
-      <w:r>
-        <w:rPr>
-          <w:rFonts w:ascii="Courier New" w:hAnsi="Courier New"/>
-          <w:shd w:fill="F3F4F6"/>
-        </w:rPr>
-        <w:t>community-hero-backend/controllers/issueController.js</w:t>
-      </w:r>
-    </w:p>
-    <w:p>
-      <w:pPr>
-        <w:numPr>
-          <w:ilvl w:val="0"/>
-          <w:numId w:val="1"/>
-        </w:numPr>
-      </w:pPr>
-      <w:r>
-        <w:rPr>
-          <w:rFonts w:ascii="Courier New" w:hAnsi="Courier New"/>
-          <w:shd w:fill="F3F4F6"/>
-        </w:rPr>
-        <w:t>community-hero-backend/middleware/auth.js</w:t>
-      </w:r>
-    </w:p>
-    <w:p>
-      <w:pPr>
-        <w:numPr>
-          <w:ilvl w:val="0"/>
-          <w:numId w:val="1"/>
-        </w:numPr>
-      </w:pPr>
-      <w:r>
-        <w:rPr>
-          <w:rFonts w:ascii="Courier New" w:hAnsi="Courier New"/>
-          <w:shd w:fill="F3F4F6"/>
-        </w:rPr>
-        <w:t>community-hero-backend/middleware/geoGuard.js</w:t>
-      </w:r>
-    </w:p>
-    <w:p>
-      <w:pPr>
-        <w:numPr>
-          <w:ilvl w:val="0"/>
-          <w:numId w:val="1"/>
-        </w:numPr>
-      </w:pPr>
-      <w:r>
-        <w:rPr>
-          <w:rFonts w:ascii="Courier New" w:hAnsi="Courier New"/>
-          <w:shd w:fill="F3F4F6"/>
-        </w:rPr>
-        <w:t>community-hero-backend/utils/geofenceService.js</w:t>
-      </w:r>
-    </w:p>
-    <w:p>
-      <w:pPr>
-        <w:numPr>
-          <w:ilvl w:val="0"/>
-          <w:numId w:val="1"/>
-        </w:numPr>
-      </w:pPr>
-      <w:r>
-        <w:rPr>
-          <w:rFonts w:ascii="Courier New" w:hAnsi="Courier New"/>
-          <w:shd w:fill="F3F4F6"/>
-        </w:rPr>
-        <w:t>community-hero-backend/utils/googleEmbeddingService.js</w:t>
-      </w:r>
-    </w:p>
-    <w:p>
-      <w:pPr>
-        <w:numPr>
-          <w:ilvl w:val="0"/>
-          <w:numId w:val="1"/>
-        </w:numPr>
-      </w:pPr>
-      <w:r>
-        <w:rPr>
-          <w:rFonts w:ascii="Courier New" w:hAnsi="Courier New"/>
-          <w:shd w:fill="F3F4F6"/>
-        </w:rPr>
-        <w:t>community-hero-backend/utils/hybridDuplicateDetector.js</w:t>
-      </w:r>
-    </w:p>
-    <w:p>
-      <w:pPr>
-        <w:numPr>
-          <w:ilvl w:val="0"/>
-          <w:numId w:val="1"/>
-        </w:numPr>
-      </w:pPr>
-      <w:r>
-        <w:rPr>
-          <w:rFonts w:ascii="Courier New" w:hAnsi="Courier New"/>
-          <w:shd w:fill="F3F4F6"/>
-        </w:rPr>
-        <w:t>community-hero-backend/utils/imageComparisonService.js</w:t>
-      </w:r>
-    </w:p>
-    <w:p>
-      <w:pPr>
-        <w:numPr>
-          <w:ilvl w:val="0"/>
-          <w:numId w:val="1"/>
-        </w:numPr>
-      </w:pPr>
-      <w:r>
-        <w:rPr>
-          <w:rFonts w:ascii="Courier New" w:hAnsi="Courier New"/>
-          <w:shd w:fill="F3F4F6"/>
-        </w:rPr>
-        <w:t>community-hero-backend/utils/knowledgeBaseService.js</w:t>
+    <w:p>
+      <w:pPr>
+        <w:numPr>
+          <w:ilvl w:val="0"/>
+          <w:numId w:val="1"/>
+        </w:numPr>
+      </w:pPr>
+      <w:r>
+        <w:rPr>
+          <w:rFonts w:ascii="Courier New" w:hAnsi="Courier New"/>
+          <w:shd w:fill="F3F4F6"/>
+        </w:rPr>
+        <w:t>firebase.json</w:t>
+      </w:r>
+    </w:p>
+    <w:p>
+      <w:pPr>
+        <w:numPr>
+          <w:ilvl w:val="0"/>
+          <w:numId w:val="1"/>
+        </w:numPr>
+      </w:pPr>
+      <w:r>
+        <w:rPr>
+          <w:rFonts w:ascii="Courier New" w:hAnsi="Courier New"/>
+          <w:shd w:fill="F3F4F6"/>
+        </w:rPr>
+        <w:t>.github/workflows/firebase-hosting-live.yml</w:t>
       </w:r>
     </w:p>
     <w:p/>
@@ -2147,7 +2088,7 @@
     <w:p/>
     <w:p>
       <w:r>
-        <w:t>Community Hero is designed as a complete hyperlocal problem-solving platform for real communities. It uses Google AI and Google Maps to make civic issue reporting intelligent, location-aware, collaborative, and transparent. The system reduces duplicate effort, verifies problems fairly, supports multi-person resolution, and preserves historical knowledge so communities become better at solving recurring problems over time.</w:t>
+        <w:t>Community Hero is designed as a complete hyperlocal problem-solving platform for real communities. It uses Google AI, Google Maps, and Firebase Hosting to make civic issue reporting intelligent, location-aware, collaborative, transparent, and easy to evaluate from a live frontend. The system reduces duplicate effort, verifies problems fairly, supports multi-person resolution, and preserves historical knowledge so communities become better at solving recurring problems over time.</w:t>
       </w:r>
     </w:p>
     <w:sectPr>

</xml_diff>